<commit_message>
Finalize team contributions in Module 5 report
</commit_message>
<xml_diff>
--- a/assignments/assignment-5-module-5/Group16_Fraud_Detection_Project_Report.docx
+++ b/assignments/assignment-5-module-5/Group16_Fraud_Detection_Project_Report.docx
@@ -257,12 +257,42 @@
         <w:pStyle w:val="Heading1"/>
       </w:pPr>
       <w:r>
-        <w:t>Group Contributions</w:t>
+        <w:t>Group Contributions:</w:t>
       </w:r>
     </w:p>
     <w:p>
       <w:r>
-        <w:t>Participating Members: Naol Melaku Ayana (Notebook, App, README), Naod Mekonnen (Model Training, Evaluation), Jerusalem Mulat Mekonnen (Report, Data Prep), Mahteme Girma Mengistu (Testing), Habtamu Miessalie Melaku (Testing).</w:t>
+        <w:t>The following members actively participated in the implementation of this project:</w:t>
+      </w:r>
+    </w:p>
+    <w:p>
+      <w:r>
+        <w:t>- Naol Melaku Ayana: Implementation Notebook, Streamlit Web Application, README documentation.</w:t>
+      </w:r>
+    </w:p>
+    <w:p>
+      <w:r>
+        <w:t>- Naod Mekonnen: Model Training, Evaluation, and Metric Analysis.</w:t>
+      </w:r>
+    </w:p>
+    <w:p>
+      <w:r>
+        <w:t>- Jerusalem Mulat Mekonnen: Project Report Drafting, Data Preparation.</w:t>
+      </w:r>
+    </w:p>
+    <w:p>
+      <w:r>
+        <w:t>- Mahteme Girma Mengistu (Mati): Prototype Testing, Input Validation.</w:t>
+      </w:r>
+    </w:p>
+    <w:p>
+      <w:r>
+        <w:t>- Habtamu Miessalie Melaku: Prototype Testing, Edge Case Verification.</w:t>
+      </w:r>
+    </w:p>
+    <w:p>
+      <w:r>
+        <w:t>Note: Members listed in the Module 4 proposal who did not participate in Module 5 have been excluded from this list, in accordance with the Module 5 guidelines.</w:t>
       </w:r>
     </w:p>
     <w:p>

</xml_diff>